<commit_message>
clarify shared world model prediction flow
</commit_message>
<xml_diff>
--- a/reports/n02-event-trigger-stage-report-20261017/N02_事件触发式动态重构实验阶段性汇报.docx
+++ b/reports/n02-event-trigger-stage-report-20261017/N02_事件触发式动态重构实验阶段性汇报.docx
@@ -1491,6 +1491,50 @@
         </w:r>
       </w:hyperlink>
     </w:p>
+    <w:p>
+      <w:pPr>
+        <w:pStyle w:val="Heading2"/>
+      </w:pPr>
+      <w:r>
+        <w:t>六点一 世界模型是一次预测还是两次预测</w:t>
+      </w:r>
+    </w:p>
+    <w:p>
+      <w:r>
+        <w:rPr>
+          <w:rFonts w:ascii="Microsoft YaHei" w:hAnsi="Microsoft YaHei"/>
+          <w:sz w:val="21"/>
+        </w:rPr>
+        <w:t>在同一个时间步、同一组候选动作上，世界模型只调用一次。一次 ensemble prediction 同时得到每个候选的后果预测均值、预测方差和候选标识，之后由事件触发器和 auxiliary critic 复用同一份结果。</w:t>
+      </w:r>
+    </w:p>
+    <w:p>
+      <w:r>
+        <w:rPr>
+          <w:rFonts w:ascii="Microsoft YaHei" w:hAnsi="Microsoft YaHei"/>
+          <w:sz w:val="21"/>
+        </w:rPr>
+        <w:t>事件触发器不会直接从所有候选中挑选预测价值最高的动作。Event-G-WM 中，触发器主要使用 NOOP 候选的预测效用判断保持当前分配是否可能恶化，并使用预测方差表示不确定性；这些量参与 d_degradation、d_uncertainty 和最终的触发指标 Γt。</w:t>
+      </w:r>
+    </w:p>
+    <w:p>
+      <w:r>
+        <w:rPr>
+          <w:rFonts w:ascii="Microsoft YaHei" w:hAnsi="Microsoft YaHei"/>
+          <w:sz w:val="21"/>
+        </w:rPr>
+        <w:t>随后，同一份候选预测被送入 auxiliary critic。critic 输出与普通 GPPO critic 相加，供 PPO 的价值估计和训练使用。最终动作仍由 GPPO actor 在合法动作掩码下选择，世界模型没有直接替代 actor 选动作。</w:t>
+      </w:r>
+    </w:p>
+    <w:p>
+      <w:r>
+        <w:rPr>
+          <w:rFonts w:ascii="Microsoft YaHei" w:hAnsi="Microsoft YaHei"/>
+          <w:sz w:val="21"/>
+        </w:rPr>
+        <w:t>因此，当前链路是：每个决策时间步对当前候选集预测一次；同一份预测结果分别服务于事件触发判断和 auxiliary critic。下一个时间步如果状态或候选集变化，会进行新的一次预测。Periodic-G-WM 仍使用世界模型辅助 critic，但触发时机由周期规则控制。</w:t>
+      </w:r>
+    </w:p>
     <w:sectPr>
       <w:headerReference w:type="default" r:id="rId9"/>
       <w:footerReference w:type="default" r:id="rId10"/>

</xml_diff>